<commit_message>
fix(pashto): Add prominent standalone EXAM QUESTIONS LINKED blocks and native Word tables
</commit_message>
<xml_diff>
--- a/4. Pashto/Q1_and_Q2_Pashto_Compulsory_Translations_and_Proverbs_2025_Master_Notes.docx
+++ b/4. Pashto/Q1_and_Q2_Pashto_Compulsory_Translations_and_Proverbs_2025_Master_Notes.docx
@@ -32,6 +32,590 @@
         </w:rPr>
         <w:t>سوال نمبر ۱ او سوال نمبر ۲: انګلیسي او پښتو ادبي ژباړې او متلونه (COMPULSORY TRANSLATIONS &amp; PROVERBS)</w:t>
       </w:r>
+    </w:p>
+    <w:tbl>
+      <w:tblPr>
+        <w:tblW w:type="auto" w:w="0"/>
+        <w:jc w:val="center"/>
+        <w:tblLayout w:type="fixed"/>
+        <w:tblLook w:firstColumn="1" w:firstRow="1" w:lastColumn="0" w:lastRow="0" w:noHBand="0" w:noVBand="1" w:val="04A0"/>
+      </w:tblPr>
+      <w:tblGrid>
+        <w:gridCol w:w="4968"/>
+        <w:gridCol w:w="4968"/>
+      </w:tblGrid>
+      <w:tr>
+        <w:tc>
+          <w:tcPr>
+            <w:tcW w:type="dxa" w:w="4968"/>
+            <w:tcMar>
+              <w:top w:w="80" w:type="dxa"/>
+              <w:bottom w:w="80" w:type="dxa"/>
+              <w:left w:w="100" w:type="dxa"/>
+              <w:right w:w="100" w:type="dxa"/>
+            </w:tcMar>
+            <w:shd w:val="clear" w:color="auto" w:fill="0E2B50"/>
+          </w:tcPr>
+          <w:p>
+            <w:pPr>
+              <w:jc w:val="right"/>
+              <w:bidi w:val="1"/>
+            </w:pPr>
+            <w:r>
+              <w:rPr>
+                <w:rFonts w:ascii="Bahij Nazanin" w:hAnsi="Bahij Nazanin"/>
+                <w:b/>
+                <w:color w:val="FFFFFF"/>
+                <w:sz w:val="19"/>
+              </w:rPr>
+              <w:t>خاصیت / Attribute</w:t>
+            </w:r>
+          </w:p>
+        </w:tc>
+        <w:tc>
+          <w:tcPr>
+            <w:tcW w:type="dxa" w:w="4968"/>
+            <w:tcMar>
+              <w:top w:w="80" w:type="dxa"/>
+              <w:bottom w:w="80" w:type="dxa"/>
+              <w:left w:w="100" w:type="dxa"/>
+              <w:right w:w="100" w:type="dxa"/>
+            </w:tcMar>
+            <w:shd w:val="clear" w:color="auto" w:fill="0E2B50"/>
+          </w:tcPr>
+          <w:p>
+            <w:pPr>
+              <w:jc w:val="right"/>
+              <w:bidi w:val="1"/>
+            </w:pPr>
+            <w:r>
+              <w:rPr>
+                <w:rFonts w:ascii="Bahij Nazanin" w:hAnsi="Bahij Nazanin"/>
+                <w:b/>
+                <w:color w:val="FFFFFF"/>
+                <w:sz w:val="19"/>
+              </w:rPr>
+              <w:t>تفصیلات / Details</w:t>
+            </w:r>
+          </w:p>
+        </w:tc>
+      </w:tr>
+      <w:tr>
+        <w:tc>
+          <w:tcPr>
+            <w:tcW w:type="dxa" w:w="4968"/>
+            <w:tcMar>
+              <w:top w:w="80" w:type="dxa"/>
+              <w:bottom w:w="80" w:type="dxa"/>
+              <w:left w:w="100" w:type="dxa"/>
+              <w:right w:w="100" w:type="dxa"/>
+            </w:tcMar>
+            <w:shd w:val="clear" w:color="auto" w:fill="F8FAFC"/>
+          </w:tcPr>
+          <w:p>
+            <w:pPr>
+              <w:jc w:val="right"/>
+              <w:bidi w:val="1"/>
+            </w:pPr>
+            <w:r>
+              <w:rPr>
+                <w:rFonts w:ascii="Bahij Nazanin" w:hAnsi="Bahij Nazanin"/>
+                <w:color w:val="1E293B"/>
+                <w:sz w:val="19"/>
+              </w:rPr>
+              <w:t>امتحاني پرچه / PAPER:</w:t>
+            </w:r>
+          </w:p>
+        </w:tc>
+        <w:tc>
+          <w:tcPr>
+            <w:tcW w:type="dxa" w:w="4968"/>
+            <w:tcMar>
+              <w:top w:w="80" w:type="dxa"/>
+              <w:bottom w:w="80" w:type="dxa"/>
+              <w:left w:w="100" w:type="dxa"/>
+              <w:right w:w="100" w:type="dxa"/>
+            </w:tcMar>
+            <w:shd w:val="clear" w:color="auto" w:fill="F8FAFC"/>
+          </w:tcPr>
+          <w:p>
+            <w:pPr>
+              <w:jc w:val="left"/>
+            </w:pPr>
+            <w:r>
+              <w:rPr>
+                <w:rFonts w:ascii="Calibri" w:hAnsi="Calibri"/>
+                <w:color w:val="1E293B"/>
+                <w:sz w:val="19"/>
+              </w:rPr>
+              <w:t>KPPSC PMS — Pashto (Optional) Written Examination 2025</w:t>
+            </w:r>
+          </w:p>
+        </w:tc>
+      </w:tr>
+      <w:tr>
+        <w:tc>
+          <w:tcPr>
+            <w:tcW w:type="dxa" w:w="4968"/>
+            <w:tcMar>
+              <w:top w:w="80" w:type="dxa"/>
+              <w:bottom w:w="80" w:type="dxa"/>
+              <w:left w:w="100" w:type="dxa"/>
+              <w:right w:w="100" w:type="dxa"/>
+            </w:tcMar>
+            <w:shd w:val="clear" w:color="auto" w:fill="FFFFFF"/>
+          </w:tcPr>
+          <w:p>
+            <w:pPr>
+              <w:jc w:val="right"/>
+              <w:bidi w:val="1"/>
+            </w:pPr>
+            <w:r>
+              <w:rPr>
+                <w:rFonts w:ascii="Bahij Nazanin" w:hAnsi="Bahij Nazanin"/>
+                <w:color w:val="1E293B"/>
+                <w:sz w:val="19"/>
+              </w:rPr>
+              <w:t>د سوال عنوان / MASTER QUESTION:</w:t>
+            </w:r>
+          </w:p>
+        </w:tc>
+        <w:tc>
+          <w:tcPr>
+            <w:tcW w:type="dxa" w:w="4968"/>
+            <w:tcMar>
+              <w:top w:w="80" w:type="dxa"/>
+              <w:bottom w:w="80" w:type="dxa"/>
+              <w:left w:w="100" w:type="dxa"/>
+              <w:right w:w="100" w:type="dxa"/>
+            </w:tcMar>
+            <w:shd w:val="clear" w:color="auto" w:fill="FFFFFF"/>
+          </w:tcPr>
+          <w:p>
+            <w:pPr>
+              <w:jc w:val="right"/>
+              <w:bidi w:val="1"/>
+            </w:pPr>
+            <w:r>
+              <w:rPr>
+                <w:rFonts w:ascii="Bahij Nazanin" w:hAnsi="Bahij Nazanin"/>
+                <w:color w:val="1E293B"/>
+                <w:sz w:val="19"/>
+              </w:rPr>
+              <w:t>سوال نمبر ۱ (الف او ب) او سوال نمبر ۲ (الف) — لازمي ادبي ژباړې او متلونه (Compulsory Translations &amp; Proverbs)</w:t>
+            </w:r>
+          </w:p>
+        </w:tc>
+      </w:tr>
+      <w:tr>
+        <w:tc>
+          <w:tcPr>
+            <w:tcW w:type="dxa" w:w="4968"/>
+            <w:tcMar>
+              <w:top w:w="80" w:type="dxa"/>
+              <w:bottom w:w="80" w:type="dxa"/>
+              <w:left w:w="100" w:type="dxa"/>
+              <w:right w:w="100" w:type="dxa"/>
+            </w:tcMar>
+            <w:shd w:val="clear" w:color="auto" w:fill="F8FAFC"/>
+          </w:tcPr>
+          <w:p>
+            <w:pPr>
+              <w:jc w:val="right"/>
+              <w:bidi w:val="1"/>
+            </w:pPr>
+            <w:r>
+              <w:rPr>
+                <w:rFonts w:ascii="Bahij Nazanin" w:hAnsi="Bahij Nazanin"/>
+                <w:color w:val="1E293B"/>
+                <w:sz w:val="19"/>
+              </w:rPr>
+              <w:t>امتحاني اړیکې / EXAM QUESTIONS LINKED:</w:t>
+            </w:r>
+          </w:p>
+        </w:tc>
+        <w:tc>
+          <w:tcPr>
+            <w:tcW w:type="dxa" w:w="4968"/>
+            <w:tcMar>
+              <w:top w:w="80" w:type="dxa"/>
+              <w:bottom w:w="80" w:type="dxa"/>
+              <w:left w:w="100" w:type="dxa"/>
+              <w:right w:w="100" w:type="dxa"/>
+            </w:tcMar>
+            <w:shd w:val="clear" w:color="auto" w:fill="F8FAFC"/>
+          </w:tcPr>
+          <w:p>
+            <w:pPr>
+              <w:jc w:val="right"/>
+              <w:bidi w:val="1"/>
+            </w:pPr>
+            <w:r>
+              <w:rPr>
+                <w:rFonts w:ascii="Bahij Nazanin" w:hAnsi="Bahij Nazanin"/>
+                <w:color w:val="1E293B"/>
+                <w:sz w:val="19"/>
+              </w:rPr>
+              <w:t>• 2025 Q.1 (الف): "A Clean and Green Pakistan is not merely an aesthetic ambition-it is the lifeline of our nation's future..." (14 Marks)</w:t>
+              <w:br/>
+              <w:t>• 2025 Q.1 (ب): "Translate any THREE of the following proverbs into authentic Pashto..." (6 Marks)</w:t>
+              <w:br/>
+              <w:t>• 2025 Q.2 (الف): "خداے پاک چې په یو لوشي قوم داسې لازم الر او بیاتي په کښې د عبادت فخر ورکړه..." (20 Marks)</w:t>
+            </w:r>
+          </w:p>
+        </w:tc>
+      </w:tr>
+      <w:tr>
+        <w:tc>
+          <w:tcPr>
+            <w:tcW w:type="dxa" w:w="4968"/>
+            <w:tcMar>
+              <w:top w:w="80" w:type="dxa"/>
+              <w:bottom w:w="80" w:type="dxa"/>
+              <w:left w:w="100" w:type="dxa"/>
+              <w:right w:w="100" w:type="dxa"/>
+            </w:tcMar>
+            <w:shd w:val="clear" w:color="auto" w:fill="FFFFFF"/>
+          </w:tcPr>
+          <w:p>
+            <w:pPr>
+              <w:jc w:val="right"/>
+              <w:bidi w:val="1"/>
+            </w:pPr>
+            <w:r>
+              <w:rPr>
+                <w:rFonts w:ascii="Bahij Nazanin" w:hAnsi="Bahij Nazanin"/>
+                <w:color w:val="1E293B"/>
+                <w:sz w:val="19"/>
+              </w:rPr>
+              <w:t>نصاب برخه / SYLLABUS THEME:</w:t>
+            </w:r>
+          </w:p>
+        </w:tc>
+        <w:tc>
+          <w:tcPr>
+            <w:tcW w:type="dxa" w:w="4968"/>
+            <w:tcMar>
+              <w:top w:w="80" w:type="dxa"/>
+              <w:bottom w:w="80" w:type="dxa"/>
+              <w:left w:w="100" w:type="dxa"/>
+              <w:right w:w="100" w:type="dxa"/>
+            </w:tcMar>
+            <w:shd w:val="clear" w:color="auto" w:fill="FFFFFF"/>
+          </w:tcPr>
+          <w:p>
+            <w:pPr>
+              <w:jc w:val="right"/>
+              <w:bidi w:val="1"/>
+            </w:pPr>
+            <w:r>
+              <w:rPr>
+                <w:rFonts w:ascii="Bahij Nazanin" w:hAnsi="Bahij Nazanin"/>
+                <w:color w:val="1E293B"/>
+                <w:sz w:val="19"/>
+              </w:rPr>
+              <w:t>برخه اول: دوه اړخیزه ژباړه، ادبي اسلوب او د پښتو متلونو کلتوري تحلیل</w:t>
+            </w:r>
+          </w:p>
+        </w:tc>
+      </w:tr>
+      <w:tr>
+        <w:tc>
+          <w:tcPr>
+            <w:tcW w:type="dxa" w:w="4968"/>
+            <w:tcMar>
+              <w:top w:w="80" w:type="dxa"/>
+              <w:bottom w:w="80" w:type="dxa"/>
+              <w:left w:w="100" w:type="dxa"/>
+              <w:right w:w="100" w:type="dxa"/>
+            </w:tcMar>
+            <w:shd w:val="clear" w:color="auto" w:fill="F8FAFC"/>
+          </w:tcPr>
+          <w:p>
+            <w:pPr>
+              <w:jc w:val="right"/>
+              <w:bidi w:val="1"/>
+            </w:pPr>
+            <w:r>
+              <w:rPr>
+                <w:rFonts w:ascii="Bahij Nazanin" w:hAnsi="Bahij Nazanin"/>
+                <w:color w:val="1E293B"/>
+                <w:sz w:val="19"/>
+              </w:rPr>
+              <w:t>ادبي او تحلیلي زاویه / LENS:</w:t>
+            </w:r>
+          </w:p>
+        </w:tc>
+        <w:tc>
+          <w:tcPr>
+            <w:tcW w:type="dxa" w:w="4968"/>
+            <w:tcMar>
+              <w:top w:w="80" w:type="dxa"/>
+              <w:bottom w:w="80" w:type="dxa"/>
+              <w:left w:w="100" w:type="dxa"/>
+              <w:right w:w="100" w:type="dxa"/>
+            </w:tcMar>
+            <w:shd w:val="clear" w:color="auto" w:fill="F8FAFC"/>
+          </w:tcPr>
+          <w:p>
+            <w:pPr>
+              <w:jc w:val="right"/>
+              <w:bidi w:val="1"/>
+            </w:pPr>
+            <w:r>
+              <w:rPr>
+                <w:rFonts w:ascii="Bahij Nazanin" w:hAnsi="Bahij Nazanin"/>
+                <w:color w:val="1E293B"/>
+                <w:sz w:val="19"/>
+              </w:rPr>
+              <w:t>ادبي ژباړه، اسلوبي بلاغت (Stylistic Register)، ژبنیز فصاحت، او کلتوري متلونه (Idiomatic Equivalents)</w:t>
+            </w:r>
+          </w:p>
+        </w:tc>
+      </w:tr>
+    </w:tbl>
+    <w:p>
+      <w:pPr>
+        <w:spacing w:after="80"/>
+      </w:pPr>
+    </w:p>
+    <w:p>
+      <w:pPr>
+        <w:spacing w:before="160" w:after="40"/>
+        <w:jc w:val="right"/>
+        <w:bidi w:val="1"/>
+      </w:pPr>
+      <w:r>
+        <w:rPr>
+          <w:rFonts w:ascii="Bahij Nazanin" w:hAnsi="Bahij Nazanin"/>
+          <w:b/>
+          <w:color w:val="0E2B50"/>
+          <w:sz w:val="24"/>
+        </w:rPr>
+        <w:t>🎯 EXAM QUESTIONS LINKED (د تېرو کلونو پوښتنې په پوره متن سره)</w:t>
+      </w:r>
+    </w:p>
+    <w:tbl>
+      <w:tblPr>
+        <w:tblW w:type="auto" w:w="0"/>
+        <w:jc w:val="center"/>
+        <w:tblLook w:firstColumn="1" w:firstRow="1" w:lastColumn="0" w:lastRow="0" w:noHBand="0" w:noVBand="1" w:val="04A0"/>
+      </w:tblPr>
+      <w:tblGrid>
+        <w:gridCol w:w="9936"/>
+      </w:tblGrid>
+      <w:tr>
+        <w:tc>
+          <w:tcPr>
+            <w:tcW w:type="dxa" w:w="9792"/>
+            <w:shd w:val="clear" w:color="auto" w:fill="F0F4F8"/>
+            <w:tcMar>
+              <w:top w:w="100" w:type="dxa"/>
+              <w:bottom w:w="100" w:type="dxa"/>
+              <w:left w:w="160" w:type="dxa"/>
+              <w:right w:w="160" w:type="dxa"/>
+            </w:tcMar>
+          </w:tcPr>
+          <w:p>
+            <w:pPr>
+              <w:spacing w:before="40" w:after="40"/>
+              <w:jc w:val="right"/>
+              <w:bidi w:val="1"/>
+            </w:pPr>
+            <w:r>
+              <w:rPr>
+                <w:rFonts w:ascii="Bahij Zar" w:hAnsi="Bahij Zar"/>
+                <w:i/>
+                <w:color w:val="0F172A"/>
+                <w:sz w:val="21"/>
+              </w:rPr>
+              <w:t>• **2025 Q.1 (الف)**: "A Clean and Green Pakistan is not merely an aesthetic ambition-it is the lifeline of our nation's future. The land that once echoed with the fragrance of orange blossoms and jasmine now struggles under the weight of urban smog and deforestation. As the adage goes, “We do not inherit the earth from our ancestors; we borrow it from our children.” If we continue to treat our soil as a dumping ground and our rivers as sewers, we will sow the wind and reap the whirlwind. The road to a verdant Pakistan lies in grassroots action-community gardens in barren plots, rooftop plantations in crowded cities, and eco-friendly alternatives replacing harmful plastics. When citizens become custodians of their environment, cleanliness transforms from a campaign into a culture, and Pakistan can blossom into the emerald heart of South Asia once more." (14 Marks)</w:t>
+            </w:r>
+          </w:p>
+        </w:tc>
+      </w:tr>
+    </w:tbl>
+    <w:p>
+      <w:pPr>
+        <w:spacing w:after="80"/>
+      </w:pPr>
+    </w:p>
+    <w:p>
+      <w:pPr>
+        <w:spacing w:line="276" w:lineRule="auto" w:before="20" w:after="80"/>
+        <w:jc w:val="both"/>
+      </w:pPr>
+      <w:r>
+        <w:rPr>
+          <w:rFonts w:ascii="Calibri" w:hAnsi="Calibri"/>
+          <w:color w:val="282828"/>
+          <w:sz w:val="22"/>
+        </w:rPr>
+        <w:t>&gt;</w:t>
+      </w:r>
+    </w:p>
+    <w:tbl>
+      <w:tblPr>
+        <w:tblW w:type="auto" w:w="0"/>
+        <w:jc w:val="center"/>
+        <w:tblLook w:firstColumn="1" w:firstRow="1" w:lastColumn="0" w:lastRow="0" w:noHBand="0" w:noVBand="1" w:val="04A0"/>
+      </w:tblPr>
+      <w:tblGrid>
+        <w:gridCol w:w="9936"/>
+      </w:tblGrid>
+      <w:tr>
+        <w:tc>
+          <w:tcPr>
+            <w:tcW w:type="dxa" w:w="9792"/>
+            <w:shd w:val="clear" w:color="auto" w:fill="F0F4F8"/>
+            <w:tcMar>
+              <w:top w:w="100" w:type="dxa"/>
+              <w:bottom w:w="100" w:type="dxa"/>
+              <w:left w:w="160" w:type="dxa"/>
+              <w:right w:w="160" w:type="dxa"/>
+            </w:tcMar>
+          </w:tcPr>
+          <w:p>
+            <w:pPr>
+              <w:spacing w:before="40" w:after="40"/>
+              <w:jc w:val="right"/>
+              <w:bidi w:val="1"/>
+            </w:pPr>
+            <w:r>
+              <w:rPr>
+                <w:rFonts w:ascii="Bahij Zar" w:hAnsi="Bahij Zar"/>
+                <w:i/>
+                <w:color w:val="0F172A"/>
+                <w:sz w:val="21"/>
+              </w:rPr>
+              <w:t>• **2025 Q.1 (ب)**: "Translate any THREE of the following proverbs into authentic Pashto: 1. When the head is alive, caps are many. 2. By the time truth is known, lies will have destroyed the village. 3. If you have money, there is no need to make request. 4. When you reach old age you become pious. 5. As the donkey, so the load. 6. Some say, what shall I do with it, others say where shall I hide it." (6 Marks)</w:t>
+            </w:r>
+          </w:p>
+        </w:tc>
+      </w:tr>
+    </w:tbl>
+    <w:p>
+      <w:pPr>
+        <w:spacing w:after="80"/>
+      </w:pPr>
+    </w:p>
+    <w:p>
+      <w:pPr>
+        <w:spacing w:line="276" w:lineRule="auto" w:before="20" w:after="80"/>
+        <w:jc w:val="both"/>
+      </w:pPr>
+      <w:r>
+        <w:rPr>
+          <w:rFonts w:ascii="Calibri" w:hAnsi="Calibri"/>
+          <w:color w:val="282828"/>
+          <w:sz w:val="22"/>
+        </w:rPr>
+        <w:t>&gt;</w:t>
+      </w:r>
+    </w:p>
+    <w:tbl>
+      <w:tblPr>
+        <w:tblW w:type="auto" w:w="0"/>
+        <w:jc w:val="center"/>
+        <w:tblLook w:firstColumn="1" w:firstRow="1" w:lastColumn="0" w:lastRow="0" w:noHBand="0" w:noVBand="1" w:val="04A0"/>
+      </w:tblPr>
+      <w:tblGrid>
+        <w:gridCol w:w="9936"/>
+      </w:tblGrid>
+      <w:tr>
+        <w:tc>
+          <w:tcPr>
+            <w:tcW w:type="dxa" w:w="9792"/>
+            <w:shd w:val="clear" w:color="auto" w:fill="F0F4F8"/>
+            <w:tcMar>
+              <w:top w:w="100" w:type="dxa"/>
+              <w:bottom w:w="100" w:type="dxa"/>
+              <w:left w:w="160" w:type="dxa"/>
+              <w:right w:w="160" w:type="dxa"/>
+            </w:tcMar>
+          </w:tcPr>
+          <w:p>
+            <w:pPr>
+              <w:spacing w:before="40" w:after="40"/>
+              <w:jc w:val="right"/>
+              <w:bidi w:val="1"/>
+            </w:pPr>
+            <w:r>
+              <w:rPr>
+                <w:rFonts w:ascii="Bahij Zar" w:hAnsi="Bahij Zar"/>
+                <w:i/>
+                <w:color w:val="0F172A"/>
+                <w:sz w:val="21"/>
+              </w:rPr>
+              <w:t>• **2025 Q.2 (الف)**: "خداے پاک چې په یو لوشي قوم داسې لازم الر او بیاتي په کښې د عبادت فخر ورکړه، کرک او هم دستې د ګلونو ورمۍ، د خلوص خوند، ښۀ اخلاق، صبر او قربانۍ ثمر په کښې شته کول او بیاتي خپل لوړے حکمت سره د بښنې او درګزر په یو انساني صورت کښې تماره کړه او د مور په شکل کښې ئې دا دنیا مخ ته راواستوله، هر ساربان وائي؛ مور آسمان نه راښکته شوے دعا ده، د انسان ژوند د تولولو لوئے، غور، ګران، په زړۀ پورې او ښکلې لفظ ،مور، دے." (20 Marks)</w:t>
+            </w:r>
+          </w:p>
+        </w:tc>
+      </w:tr>
+    </w:tbl>
+    <w:p>
+      <w:pPr>
+        <w:spacing w:after="80"/>
+      </w:pPr>
+    </w:p>
+    <w:p>
+      <w:pPr>
+        <w:spacing w:line="276" w:lineRule="auto" w:before="20" w:after="80"/>
+        <w:jc w:val="both"/>
+      </w:pPr>
+      <w:r>
+        <w:rPr>
+          <w:rFonts w:ascii="Calibri" w:hAnsi="Calibri"/>
+          <w:color w:val="282828"/>
+          <w:sz w:val="22"/>
+        </w:rPr>
+        <w:t>&gt;</w:t>
+      </w:r>
+    </w:p>
+    <w:tbl>
+      <w:tblPr>
+        <w:tblW w:type="auto" w:w="0"/>
+        <w:jc w:val="center"/>
+        <w:tblLook w:firstColumn="1" w:firstRow="1" w:lastColumn="0" w:lastRow="0" w:noHBand="0" w:noVBand="1" w:val="04A0"/>
+      </w:tblPr>
+      <w:tblGrid>
+        <w:gridCol w:w="9936"/>
+      </w:tblGrid>
+      <w:tr>
+        <w:tc>
+          <w:tcPr>
+            <w:tcW w:type="dxa" w:w="9792"/>
+            <w:shd w:val="clear" w:color="auto" w:fill="F0F4F8"/>
+            <w:tcMar>
+              <w:top w:w="100" w:type="dxa"/>
+              <w:bottom w:w="100" w:type="dxa"/>
+              <w:left w:w="160" w:type="dxa"/>
+              <w:right w:w="160" w:type="dxa"/>
+            </w:tcMar>
+          </w:tcPr>
+          <w:p>
+            <w:pPr>
+              <w:spacing w:before="40" w:after="40"/>
+              <w:jc w:val="right"/>
+              <w:bidi w:val="1"/>
+            </w:pPr>
+            <w:r>
+              <w:rPr>
+                <w:rFonts w:ascii="Bahij Zar" w:hAnsi="Bahij Zar"/>
+                <w:i/>
+                <w:color w:val="0F172A"/>
+                <w:sz w:val="21"/>
+              </w:rPr>
+              <w:t>• **2022 Q.2**: "دغه لاندینی عبارت د انګرېزي نه پښتو کښې ترجمه کړئ او په متلونو (Proverbs) کښې درې د انګرېزي نه پښتو ته واړوئ۔" (20 Marks)</w:t>
+            </w:r>
+          </w:p>
+        </w:tc>
+      </w:tr>
+    </w:tbl>
+    <w:p>
+      <w:pPr>
+        <w:spacing w:after="80"/>
+      </w:pPr>
     </w:p>
     <w:p>
       <w:pPr>
@@ -259,6 +843,758 @@
         <w:t>📊 د متلونو او اصطلاحاتو پرتلیزه تحلیلي جدول (Proverbs Matrix)</w:t>
       </w:r>
     </w:p>
+    <w:tbl>
+      <w:tblPr>
+        <w:tblW w:type="auto" w:w="0"/>
+        <w:jc w:val="center"/>
+        <w:tblLayout w:type="fixed"/>
+        <w:tblLook w:firstColumn="1" w:firstRow="1" w:lastColumn="0" w:lastRow="0" w:noHBand="0" w:noVBand="1" w:val="04A0"/>
+      </w:tblPr>
+      <w:tblGrid>
+        <w:gridCol w:w="2484"/>
+        <w:gridCol w:w="2484"/>
+        <w:gridCol w:w="2484"/>
+        <w:gridCol w:w="2484"/>
+      </w:tblGrid>
+      <w:tr>
+        <w:tc>
+          <w:tcPr>
+            <w:tcW w:type="dxa" w:w="2484"/>
+            <w:tcMar>
+              <w:top w:w="80" w:type="dxa"/>
+              <w:bottom w:w="80" w:type="dxa"/>
+              <w:left w:w="100" w:type="dxa"/>
+              <w:right w:w="100" w:type="dxa"/>
+            </w:tcMar>
+            <w:shd w:val="clear" w:color="auto" w:fill="0E2B50"/>
+          </w:tcPr>
+          <w:p>
+            <w:pPr>
+              <w:jc w:val="left"/>
+            </w:pPr>
+            <w:r>
+              <w:rPr>
+                <w:rFonts w:ascii="Calibri" w:hAnsi="Calibri"/>
+                <w:b/>
+                <w:color w:val="FFFFFF"/>
+                <w:sz w:val="19"/>
+              </w:rPr>
+              <w:t>#</w:t>
+            </w:r>
+          </w:p>
+        </w:tc>
+        <w:tc>
+          <w:tcPr>
+            <w:tcW w:type="dxa" w:w="2484"/>
+            <w:tcMar>
+              <w:top w:w="80" w:type="dxa"/>
+              <w:bottom w:w="80" w:type="dxa"/>
+              <w:left w:w="100" w:type="dxa"/>
+              <w:right w:w="100" w:type="dxa"/>
+            </w:tcMar>
+            <w:shd w:val="clear" w:color="auto" w:fill="0E2B50"/>
+          </w:tcPr>
+          <w:p>
+            <w:pPr>
+              <w:jc w:val="right"/>
+              <w:bidi w:val="1"/>
+            </w:pPr>
+            <w:r>
+              <w:rPr>
+                <w:rFonts w:ascii="Bahij Nazanin" w:hAnsi="Bahij Nazanin"/>
+                <w:b/>
+                <w:color w:val="FFFFFF"/>
+                <w:sz w:val="19"/>
+              </w:rPr>
+              <w:t>انګلیسي متل (English Proverb)</w:t>
+            </w:r>
+          </w:p>
+        </w:tc>
+        <w:tc>
+          <w:tcPr>
+            <w:tcW w:type="dxa" w:w="2484"/>
+            <w:tcMar>
+              <w:top w:w="80" w:type="dxa"/>
+              <w:bottom w:w="80" w:type="dxa"/>
+              <w:left w:w="100" w:type="dxa"/>
+              <w:right w:w="100" w:type="dxa"/>
+            </w:tcMar>
+            <w:shd w:val="clear" w:color="auto" w:fill="0E2B50"/>
+          </w:tcPr>
+          <w:p>
+            <w:pPr>
+              <w:jc w:val="right"/>
+              <w:bidi w:val="1"/>
+            </w:pPr>
+            <w:r>
+              <w:rPr>
+                <w:rFonts w:ascii="Bahij Nazanin" w:hAnsi="Bahij Nazanin"/>
+                <w:b/>
+                <w:color w:val="FFFFFF"/>
+                <w:sz w:val="19"/>
+              </w:rPr>
+              <w:t>کره پښتو متل (Authentic Pashto Proverb)</w:t>
+            </w:r>
+          </w:p>
+        </w:tc>
+        <w:tc>
+          <w:tcPr>
+            <w:tcW w:type="dxa" w:w="2484"/>
+            <w:tcMar>
+              <w:top w:w="80" w:type="dxa"/>
+              <w:bottom w:w="80" w:type="dxa"/>
+              <w:left w:w="100" w:type="dxa"/>
+              <w:right w:w="100" w:type="dxa"/>
+            </w:tcMar>
+            <w:shd w:val="clear" w:color="auto" w:fill="0E2B50"/>
+          </w:tcPr>
+          <w:p>
+            <w:pPr>
+              <w:jc w:val="right"/>
+              <w:bidi w:val="1"/>
+            </w:pPr>
+            <w:r>
+              <w:rPr>
+                <w:rFonts w:ascii="Bahij Nazanin" w:hAnsi="Bahij Nazanin"/>
+                <w:b/>
+                <w:color w:val="FFFFFF"/>
+                <w:sz w:val="19"/>
+              </w:rPr>
+              <w:t>ادبي او کلتوري مفهوم (Cultural Significance)</w:t>
+            </w:r>
+          </w:p>
+        </w:tc>
+      </w:tr>
+      <w:tr>
+        <w:tc>
+          <w:tcPr>
+            <w:tcW w:type="dxa" w:w="2484"/>
+            <w:tcMar>
+              <w:top w:w="80" w:type="dxa"/>
+              <w:bottom w:w="80" w:type="dxa"/>
+              <w:left w:w="100" w:type="dxa"/>
+              <w:right w:w="100" w:type="dxa"/>
+            </w:tcMar>
+            <w:shd w:val="clear" w:color="auto" w:fill="F8FAFC"/>
+          </w:tcPr>
+          <w:p>
+            <w:pPr>
+              <w:jc w:val="left"/>
+            </w:pPr>
+            <w:r>
+              <w:rPr>
+                <w:rFonts w:ascii="Calibri" w:hAnsi="Calibri"/>
+                <w:color w:val="1E293B"/>
+                <w:sz w:val="19"/>
+              </w:rPr>
+              <w:t>1</w:t>
+            </w:r>
+          </w:p>
+        </w:tc>
+        <w:tc>
+          <w:tcPr>
+            <w:tcW w:type="dxa" w:w="2484"/>
+            <w:tcMar>
+              <w:top w:w="80" w:type="dxa"/>
+              <w:bottom w:w="80" w:type="dxa"/>
+              <w:left w:w="100" w:type="dxa"/>
+              <w:right w:w="100" w:type="dxa"/>
+            </w:tcMar>
+            <w:shd w:val="clear" w:color="auto" w:fill="F8FAFC"/>
+          </w:tcPr>
+          <w:p>
+            <w:pPr>
+              <w:jc w:val="left"/>
+            </w:pPr>
+            <w:r>
+              <w:rPr>
+                <w:rFonts w:ascii="Calibri" w:hAnsi="Calibri"/>
+                <w:color w:val="1E293B"/>
+                <w:sz w:val="19"/>
+              </w:rPr>
+              <w:t>*When the head is alive, caps are many.*</w:t>
+            </w:r>
+          </w:p>
+        </w:tc>
+        <w:tc>
+          <w:tcPr>
+            <w:tcW w:type="dxa" w:w="2484"/>
+            <w:tcMar>
+              <w:top w:w="80" w:type="dxa"/>
+              <w:bottom w:w="80" w:type="dxa"/>
+              <w:left w:w="100" w:type="dxa"/>
+              <w:right w:w="100" w:type="dxa"/>
+            </w:tcMar>
+            <w:shd w:val="clear" w:color="auto" w:fill="F8FAFC"/>
+          </w:tcPr>
+          <w:p>
+            <w:pPr>
+              <w:jc w:val="right"/>
+              <w:bidi w:val="1"/>
+            </w:pPr>
+            <w:r>
+              <w:rPr>
+                <w:rFonts w:ascii="Bahij Nazanin" w:hAnsi="Bahij Nazanin"/>
+                <w:color w:val="1E293B"/>
+                <w:sz w:val="19"/>
+              </w:rPr>
+              <w:t>چې سر ژوندی وي، خولۍ ډېرې دي۔</w:t>
+            </w:r>
+          </w:p>
+        </w:tc>
+        <w:tc>
+          <w:tcPr>
+            <w:tcW w:type="dxa" w:w="2484"/>
+            <w:tcMar>
+              <w:top w:w="80" w:type="dxa"/>
+              <w:bottom w:w="80" w:type="dxa"/>
+              <w:left w:w="100" w:type="dxa"/>
+              <w:right w:w="100" w:type="dxa"/>
+            </w:tcMar>
+            <w:shd w:val="clear" w:color="auto" w:fill="F8FAFC"/>
+          </w:tcPr>
+          <w:p>
+            <w:pPr>
+              <w:jc w:val="right"/>
+              <w:bidi w:val="1"/>
+            </w:pPr>
+            <w:r>
+              <w:rPr>
+                <w:rFonts w:ascii="Bahij Nazanin" w:hAnsi="Bahij Nazanin"/>
+                <w:color w:val="1E293B"/>
+                <w:sz w:val="19"/>
+              </w:rPr>
+              <w:t>ژوند او وقار اصل دی؛ مادي شیان او وسایل بیا پیدا کېدای شي، خو چې انسان ژوندی وي، نو عزت او لارې چارې نه ورکېږي۔</w:t>
+            </w:r>
+          </w:p>
+        </w:tc>
+      </w:tr>
+      <w:tr>
+        <w:tc>
+          <w:tcPr>
+            <w:tcW w:type="dxa" w:w="2484"/>
+            <w:tcMar>
+              <w:top w:w="80" w:type="dxa"/>
+              <w:bottom w:w="80" w:type="dxa"/>
+              <w:left w:w="100" w:type="dxa"/>
+              <w:right w:w="100" w:type="dxa"/>
+            </w:tcMar>
+            <w:shd w:val="clear" w:color="auto" w:fill="FFFFFF"/>
+          </w:tcPr>
+          <w:p>
+            <w:pPr>
+              <w:jc w:val="left"/>
+            </w:pPr>
+            <w:r>
+              <w:rPr>
+                <w:rFonts w:ascii="Calibri" w:hAnsi="Calibri"/>
+                <w:color w:val="1E293B"/>
+                <w:sz w:val="19"/>
+              </w:rPr>
+              <w:t>2</w:t>
+            </w:r>
+          </w:p>
+        </w:tc>
+        <w:tc>
+          <w:tcPr>
+            <w:tcW w:type="dxa" w:w="2484"/>
+            <w:tcMar>
+              <w:top w:w="80" w:type="dxa"/>
+              <w:bottom w:w="80" w:type="dxa"/>
+              <w:left w:w="100" w:type="dxa"/>
+              <w:right w:w="100" w:type="dxa"/>
+            </w:tcMar>
+            <w:shd w:val="clear" w:color="auto" w:fill="FFFFFF"/>
+          </w:tcPr>
+          <w:p>
+            <w:pPr>
+              <w:jc w:val="left"/>
+            </w:pPr>
+            <w:r>
+              <w:rPr>
+                <w:rFonts w:ascii="Calibri" w:hAnsi="Calibri"/>
+                <w:color w:val="1E293B"/>
+                <w:sz w:val="19"/>
+              </w:rPr>
+              <w:t>*By the time truth is known, lies will have destroyed the village.*</w:t>
+            </w:r>
+          </w:p>
+        </w:tc>
+        <w:tc>
+          <w:tcPr>
+            <w:tcW w:type="dxa" w:w="2484"/>
+            <w:tcMar>
+              <w:top w:w="80" w:type="dxa"/>
+              <w:bottom w:w="80" w:type="dxa"/>
+              <w:left w:w="100" w:type="dxa"/>
+              <w:right w:w="100" w:type="dxa"/>
+            </w:tcMar>
+            <w:shd w:val="clear" w:color="auto" w:fill="FFFFFF"/>
+          </w:tcPr>
+          <w:p>
+            <w:pPr>
+              <w:jc w:val="right"/>
+              <w:bidi w:val="1"/>
+            </w:pPr>
+            <w:r>
+              <w:rPr>
+                <w:rFonts w:ascii="Bahij Nazanin" w:hAnsi="Bahij Nazanin"/>
+                <w:color w:val="1E293B"/>
+                <w:sz w:val="19"/>
+              </w:rPr>
+              <w:t>تر څو چې رښتیا راځي، درواغو به کلي وران کړي وي۔</w:t>
+            </w:r>
+          </w:p>
+        </w:tc>
+        <w:tc>
+          <w:tcPr>
+            <w:tcW w:type="dxa" w:w="2484"/>
+            <w:tcMar>
+              <w:top w:w="80" w:type="dxa"/>
+              <w:bottom w:w="80" w:type="dxa"/>
+              <w:left w:w="100" w:type="dxa"/>
+              <w:right w:w="100" w:type="dxa"/>
+            </w:tcMar>
+            <w:shd w:val="clear" w:color="auto" w:fill="FFFFFF"/>
+          </w:tcPr>
+          <w:p>
+            <w:pPr>
+              <w:jc w:val="right"/>
+              <w:bidi w:val="1"/>
+            </w:pPr>
+            <w:r>
+              <w:rPr>
+                <w:rFonts w:ascii="Bahij Nazanin" w:hAnsi="Bahij Nazanin"/>
+                <w:color w:val="1E293B"/>
+                <w:sz w:val="19"/>
+              </w:rPr>
+              <w:t>د درواغو او اوازو ناوړه او ویجاړونکی سرعت، چې د حقیقت له څرګندېدو وړاندې ټولنه تباه کوي۔</w:t>
+            </w:r>
+          </w:p>
+        </w:tc>
+      </w:tr>
+      <w:tr>
+        <w:tc>
+          <w:tcPr>
+            <w:tcW w:type="dxa" w:w="2484"/>
+            <w:tcMar>
+              <w:top w:w="80" w:type="dxa"/>
+              <w:bottom w:w="80" w:type="dxa"/>
+              <w:left w:w="100" w:type="dxa"/>
+              <w:right w:w="100" w:type="dxa"/>
+            </w:tcMar>
+            <w:shd w:val="clear" w:color="auto" w:fill="F8FAFC"/>
+          </w:tcPr>
+          <w:p>
+            <w:pPr>
+              <w:jc w:val="left"/>
+            </w:pPr>
+            <w:r>
+              <w:rPr>
+                <w:rFonts w:ascii="Calibri" w:hAnsi="Calibri"/>
+                <w:color w:val="1E293B"/>
+                <w:sz w:val="19"/>
+              </w:rPr>
+              <w:t>3</w:t>
+            </w:r>
+          </w:p>
+        </w:tc>
+        <w:tc>
+          <w:tcPr>
+            <w:tcW w:type="dxa" w:w="2484"/>
+            <w:tcMar>
+              <w:top w:w="80" w:type="dxa"/>
+              <w:bottom w:w="80" w:type="dxa"/>
+              <w:left w:w="100" w:type="dxa"/>
+              <w:right w:w="100" w:type="dxa"/>
+            </w:tcMar>
+            <w:shd w:val="clear" w:color="auto" w:fill="F8FAFC"/>
+          </w:tcPr>
+          <w:p>
+            <w:pPr>
+              <w:jc w:val="left"/>
+            </w:pPr>
+            <w:r>
+              <w:rPr>
+                <w:rFonts w:ascii="Calibri" w:hAnsi="Calibri"/>
+                <w:color w:val="1E293B"/>
+                <w:sz w:val="19"/>
+              </w:rPr>
+              <w:t>*If you have money, there is no need to make request.*</w:t>
+            </w:r>
+          </w:p>
+        </w:tc>
+        <w:tc>
+          <w:tcPr>
+            <w:tcW w:type="dxa" w:w="2484"/>
+            <w:tcMar>
+              <w:top w:w="80" w:type="dxa"/>
+              <w:bottom w:w="80" w:type="dxa"/>
+              <w:left w:w="100" w:type="dxa"/>
+              <w:right w:w="100" w:type="dxa"/>
+            </w:tcMar>
+            <w:shd w:val="clear" w:color="auto" w:fill="F8FAFC"/>
+          </w:tcPr>
+          <w:p>
+            <w:pPr>
+              <w:jc w:val="right"/>
+              <w:bidi w:val="1"/>
+            </w:pPr>
+            <w:r>
+              <w:rPr>
+                <w:rFonts w:ascii="Bahij Nazanin" w:hAnsi="Bahij Nazanin"/>
+                <w:color w:val="1E293B"/>
+                <w:sz w:val="19"/>
+              </w:rPr>
+              <w:t>چې پیسې وي، منت ته څه حاجت / چې روپۍ وي نو کږه خولۍ وي۔</w:t>
+            </w:r>
+          </w:p>
+        </w:tc>
+        <w:tc>
+          <w:tcPr>
+            <w:tcW w:type="dxa" w:w="2484"/>
+            <w:tcMar>
+              <w:top w:w="80" w:type="dxa"/>
+              <w:bottom w:w="80" w:type="dxa"/>
+              <w:left w:w="100" w:type="dxa"/>
+              <w:right w:w="100" w:type="dxa"/>
+            </w:tcMar>
+            <w:shd w:val="clear" w:color="auto" w:fill="F8FAFC"/>
+          </w:tcPr>
+          <w:p>
+            <w:pPr>
+              <w:jc w:val="right"/>
+              <w:bidi w:val="1"/>
+            </w:pPr>
+            <w:r>
+              <w:rPr>
+                <w:rFonts w:ascii="Bahij Nazanin" w:hAnsi="Bahij Nazanin"/>
+                <w:color w:val="1E293B"/>
+                <w:sz w:val="19"/>
+              </w:rPr>
+              <w:t>د مال او دولت ټولنیز اغېز؛ شتمن سړی د چا سوال او منت ته نه اړ کېږي۔</w:t>
+            </w:r>
+          </w:p>
+        </w:tc>
+      </w:tr>
+      <w:tr>
+        <w:tc>
+          <w:tcPr>
+            <w:tcW w:type="dxa" w:w="2484"/>
+            <w:tcMar>
+              <w:top w:w="80" w:type="dxa"/>
+              <w:bottom w:w="80" w:type="dxa"/>
+              <w:left w:w="100" w:type="dxa"/>
+              <w:right w:w="100" w:type="dxa"/>
+            </w:tcMar>
+            <w:shd w:val="clear" w:color="auto" w:fill="FFFFFF"/>
+          </w:tcPr>
+          <w:p>
+            <w:pPr>
+              <w:jc w:val="left"/>
+            </w:pPr>
+            <w:r>
+              <w:rPr>
+                <w:rFonts w:ascii="Calibri" w:hAnsi="Calibri"/>
+                <w:color w:val="1E293B"/>
+                <w:sz w:val="19"/>
+              </w:rPr>
+              <w:t>4</w:t>
+            </w:r>
+          </w:p>
+        </w:tc>
+        <w:tc>
+          <w:tcPr>
+            <w:tcW w:type="dxa" w:w="2484"/>
+            <w:tcMar>
+              <w:top w:w="80" w:type="dxa"/>
+              <w:bottom w:w="80" w:type="dxa"/>
+              <w:left w:w="100" w:type="dxa"/>
+              <w:right w:w="100" w:type="dxa"/>
+            </w:tcMar>
+            <w:shd w:val="clear" w:color="auto" w:fill="FFFFFF"/>
+          </w:tcPr>
+          <w:p>
+            <w:pPr>
+              <w:jc w:val="left"/>
+            </w:pPr>
+            <w:r>
+              <w:rPr>
+                <w:rFonts w:ascii="Calibri" w:hAnsi="Calibri"/>
+                <w:color w:val="1E293B"/>
+                <w:sz w:val="19"/>
+              </w:rPr>
+              <w:t>*When you reach old age you become pious.*</w:t>
+            </w:r>
+          </w:p>
+        </w:tc>
+        <w:tc>
+          <w:tcPr>
+            <w:tcW w:type="dxa" w:w="2484"/>
+            <w:tcMar>
+              <w:top w:w="80" w:type="dxa"/>
+              <w:bottom w:w="80" w:type="dxa"/>
+              <w:left w:w="100" w:type="dxa"/>
+              <w:right w:w="100" w:type="dxa"/>
+            </w:tcMar>
+            <w:shd w:val="clear" w:color="auto" w:fill="FFFFFF"/>
+          </w:tcPr>
+          <w:p>
+            <w:pPr>
+              <w:jc w:val="right"/>
+              <w:bidi w:val="1"/>
+            </w:pPr>
+            <w:r>
+              <w:rPr>
+                <w:rFonts w:ascii="Bahij Nazanin" w:hAnsi="Bahij Nazanin"/>
+                <w:color w:val="1E293B"/>
+                <w:sz w:val="19"/>
+              </w:rPr>
+              <w:t>په بوډاتوب کښې توبه ګار شې / کبر کښې توبه او بوډاتوب کښې پرهېزګاري۔</w:t>
+            </w:r>
+          </w:p>
+        </w:tc>
+        <w:tc>
+          <w:tcPr>
+            <w:tcW w:type="dxa" w:w="2484"/>
+            <w:tcMar>
+              <w:top w:w="80" w:type="dxa"/>
+              <w:bottom w:w="80" w:type="dxa"/>
+              <w:left w:w="100" w:type="dxa"/>
+              <w:right w:w="100" w:type="dxa"/>
+            </w:tcMar>
+            <w:shd w:val="clear" w:color="auto" w:fill="FFFFFF"/>
+          </w:tcPr>
+          <w:p>
+            <w:pPr>
+              <w:jc w:val="right"/>
+              <w:bidi w:val="1"/>
+            </w:pPr>
+            <w:r>
+              <w:rPr>
+                <w:rFonts w:ascii="Bahij Nazanin" w:hAnsi="Bahij Nazanin"/>
+                <w:color w:val="1E293B"/>
+                <w:sz w:val="19"/>
+              </w:rPr>
+              <w:t>د وس او توان له لاسه وتلو وروسته ریاکارانه عبادت؛ کله چې انسان ګناه نشي کولای نو د تقوا دعوه کوي۔</w:t>
+            </w:r>
+          </w:p>
+        </w:tc>
+      </w:tr>
+      <w:tr>
+        <w:tc>
+          <w:tcPr>
+            <w:tcW w:type="dxa" w:w="2484"/>
+            <w:tcMar>
+              <w:top w:w="80" w:type="dxa"/>
+              <w:bottom w:w="80" w:type="dxa"/>
+              <w:left w:w="100" w:type="dxa"/>
+              <w:right w:w="100" w:type="dxa"/>
+            </w:tcMar>
+            <w:shd w:val="clear" w:color="auto" w:fill="F8FAFC"/>
+          </w:tcPr>
+          <w:p>
+            <w:pPr>
+              <w:jc w:val="left"/>
+            </w:pPr>
+            <w:r>
+              <w:rPr>
+                <w:rFonts w:ascii="Calibri" w:hAnsi="Calibri"/>
+                <w:color w:val="1E293B"/>
+                <w:sz w:val="19"/>
+              </w:rPr>
+              <w:t>5</w:t>
+            </w:r>
+          </w:p>
+        </w:tc>
+        <w:tc>
+          <w:tcPr>
+            <w:tcW w:type="dxa" w:w="2484"/>
+            <w:tcMar>
+              <w:top w:w="80" w:type="dxa"/>
+              <w:bottom w:w="80" w:type="dxa"/>
+              <w:left w:w="100" w:type="dxa"/>
+              <w:right w:w="100" w:type="dxa"/>
+            </w:tcMar>
+            <w:shd w:val="clear" w:color="auto" w:fill="F8FAFC"/>
+          </w:tcPr>
+          <w:p>
+            <w:pPr>
+              <w:jc w:val="left"/>
+            </w:pPr>
+            <w:r>
+              <w:rPr>
+                <w:rFonts w:ascii="Calibri" w:hAnsi="Calibri"/>
+                <w:color w:val="1E293B"/>
+                <w:sz w:val="19"/>
+              </w:rPr>
+              <w:t>*As the donkey, so the load.*</w:t>
+            </w:r>
+          </w:p>
+        </w:tc>
+        <w:tc>
+          <w:tcPr>
+            <w:tcW w:type="dxa" w:w="2484"/>
+            <w:tcMar>
+              <w:top w:w="80" w:type="dxa"/>
+              <w:bottom w:w="80" w:type="dxa"/>
+              <w:left w:w="100" w:type="dxa"/>
+              <w:right w:w="100" w:type="dxa"/>
+            </w:tcMar>
+            <w:shd w:val="clear" w:color="auto" w:fill="F8FAFC"/>
+          </w:tcPr>
+          <w:p>
+            <w:pPr>
+              <w:jc w:val="right"/>
+              <w:bidi w:val="1"/>
+            </w:pPr>
+            <w:r>
+              <w:rPr>
+                <w:rFonts w:ascii="Bahij Nazanin" w:hAnsi="Bahij Nazanin"/>
+                <w:color w:val="1E293B"/>
+                <w:sz w:val="19"/>
+              </w:rPr>
+              <w:t>لکه خر هماغسې بار / د خره هومره بار وي۔</w:t>
+            </w:r>
+          </w:p>
+        </w:tc>
+        <w:tc>
+          <w:tcPr>
+            <w:tcW w:type="dxa" w:w="2484"/>
+            <w:tcMar>
+              <w:top w:w="80" w:type="dxa"/>
+              <w:bottom w:w="80" w:type="dxa"/>
+              <w:left w:w="100" w:type="dxa"/>
+              <w:right w:w="100" w:type="dxa"/>
+            </w:tcMar>
+            <w:shd w:val="clear" w:color="auto" w:fill="F8FAFC"/>
+          </w:tcPr>
+          <w:p>
+            <w:pPr>
+              <w:jc w:val="right"/>
+              <w:bidi w:val="1"/>
+            </w:pPr>
+            <w:r>
+              <w:rPr>
+                <w:rFonts w:ascii="Bahij Nazanin" w:hAnsi="Bahij Nazanin"/>
+                <w:color w:val="1E293B"/>
+                <w:sz w:val="19"/>
+              </w:rPr>
+              <w:t>د هر چا بار او مسؤولیت د هغه د ظرفیت او بې وسۍ مطابق ټاکل کېږي؛ له کم ظرفه سړي سره هماغسې چلند کېږي۔</w:t>
+            </w:r>
+          </w:p>
+        </w:tc>
+      </w:tr>
+      <w:tr>
+        <w:tc>
+          <w:tcPr>
+            <w:tcW w:type="dxa" w:w="2484"/>
+            <w:tcMar>
+              <w:top w:w="80" w:type="dxa"/>
+              <w:bottom w:w="80" w:type="dxa"/>
+              <w:left w:w="100" w:type="dxa"/>
+              <w:right w:w="100" w:type="dxa"/>
+            </w:tcMar>
+            <w:shd w:val="clear" w:color="auto" w:fill="FFFFFF"/>
+          </w:tcPr>
+          <w:p>
+            <w:pPr>
+              <w:jc w:val="left"/>
+            </w:pPr>
+            <w:r>
+              <w:rPr>
+                <w:rFonts w:ascii="Calibri" w:hAnsi="Calibri"/>
+                <w:color w:val="1E293B"/>
+                <w:sz w:val="19"/>
+              </w:rPr>
+              <w:t>6</w:t>
+            </w:r>
+          </w:p>
+        </w:tc>
+        <w:tc>
+          <w:tcPr>
+            <w:tcW w:type="dxa" w:w="2484"/>
+            <w:tcMar>
+              <w:top w:w="80" w:type="dxa"/>
+              <w:bottom w:w="80" w:type="dxa"/>
+              <w:left w:w="100" w:type="dxa"/>
+              <w:right w:w="100" w:type="dxa"/>
+            </w:tcMar>
+            <w:shd w:val="clear" w:color="auto" w:fill="FFFFFF"/>
+          </w:tcPr>
+          <w:p>
+            <w:pPr>
+              <w:jc w:val="left"/>
+            </w:pPr>
+            <w:r>
+              <w:rPr>
+                <w:rFonts w:ascii="Calibri" w:hAnsi="Calibri"/>
+                <w:color w:val="1E293B"/>
+                <w:sz w:val="19"/>
+              </w:rPr>
+              <w:t>*Some say, what shall I do with it, others say where shall I hide it.*</w:t>
+            </w:r>
+          </w:p>
+        </w:tc>
+        <w:tc>
+          <w:tcPr>
+            <w:tcW w:type="dxa" w:w="2484"/>
+            <w:tcMar>
+              <w:top w:w="80" w:type="dxa"/>
+              <w:bottom w:w="80" w:type="dxa"/>
+              <w:left w:w="100" w:type="dxa"/>
+              <w:right w:w="100" w:type="dxa"/>
+            </w:tcMar>
+            <w:shd w:val="clear" w:color="auto" w:fill="FFFFFF"/>
+          </w:tcPr>
+          <w:p>
+            <w:pPr>
+              <w:jc w:val="right"/>
+              <w:bidi w:val="1"/>
+            </w:pPr>
+            <w:r>
+              <w:rPr>
+                <w:rFonts w:ascii="Bahij Nazanin" w:hAnsi="Bahij Nazanin"/>
+                <w:color w:val="1E293B"/>
+                <w:sz w:val="19"/>
+              </w:rPr>
+              <w:t>یو وائي څه پرې وکړم، بل وائي چېرته ئې پټ کړم۔</w:t>
+            </w:r>
+          </w:p>
+        </w:tc>
+        <w:tc>
+          <w:tcPr>
+            <w:tcW w:type="dxa" w:w="2484"/>
+            <w:tcMar>
+              <w:top w:w="80" w:type="dxa"/>
+              <w:bottom w:w="80" w:type="dxa"/>
+              <w:left w:w="100" w:type="dxa"/>
+              <w:right w:w="100" w:type="dxa"/>
+            </w:tcMar>
+            <w:shd w:val="clear" w:color="auto" w:fill="FFFFFF"/>
+          </w:tcPr>
+          <w:p>
+            <w:pPr>
+              <w:jc w:val="right"/>
+              <w:bidi w:val="1"/>
+            </w:pPr>
+            <w:r>
+              <w:rPr>
+                <w:rFonts w:ascii="Bahij Nazanin" w:hAnsi="Bahij Nazanin"/>
+                <w:color w:val="1E293B"/>
+                <w:sz w:val="19"/>
+              </w:rPr>
+              <w:t>په ټولنه کې د بې وسۍ او شتمنۍ تضاد؛ یو سړی د ډوډۍ نشتوالي حیران کړی او بل د مال او دولت پټولو په غم اخته دی۔</w:t>
+            </w:r>
+          </w:p>
+        </w:tc>
+      </w:tr>
+    </w:tbl>
+    <w:p>
+      <w:pPr>
+        <w:spacing w:after="80"/>
+      </w:pPr>
+    </w:p>
     <w:p>
       <w:pPr>
         <w:spacing w:before="200" w:after="80"/>
@@ -315,12 +1651,11 @@
           <w:p>
             <w:pPr>
               <w:spacing w:before="40" w:after="40"/>
-              <w:jc w:val="right"/>
-              <w:bidi w:val="1"/>
+              <w:jc w:val="left"/>
             </w:pPr>
             <w:r>
               <w:rPr>
-                <w:rFonts w:ascii="Bahij Zar" w:hAnsi="Bahij Zar"/>
+                <w:rFonts w:ascii="Georgia" w:hAnsi="Georgia"/>
                 <w:i/>
                 <w:color w:val="0F172A"/>
                 <w:sz w:val="21"/>
@@ -514,12 +1849,11 @@
           <w:p>
             <w:pPr>
               <w:spacing w:before="40" w:after="40"/>
-              <w:jc w:val="right"/>
-              <w:bidi w:val="1"/>
+              <w:jc w:val="left"/>
             </w:pPr>
             <w:r>
               <w:rPr>
-                <w:rFonts w:ascii="Bahij Zar" w:hAnsi="Bahij Zar"/>
+                <w:rFonts w:ascii="Georgia" w:hAnsi="Georgia"/>
                 <w:i/>
                 <w:color w:val="0F172A"/>
                 <w:sz w:val="21"/>
@@ -550,6 +1884,814 @@
         </w:rPr>
         <w:t>💬 د ژباړې او ادبي اصولو اقوال (Academic Quotations on Translation)</w:t>
       </w:r>
+    </w:p>
+    <w:tbl>
+      <w:tblPr>
+        <w:tblW w:type="auto" w:w="0"/>
+        <w:jc w:val="center"/>
+        <w:tblLayout w:type="fixed"/>
+        <w:tblLook w:firstColumn="1" w:firstRow="1" w:lastColumn="0" w:lastRow="0" w:noHBand="0" w:noVBand="1" w:val="04A0"/>
+      </w:tblPr>
+      <w:tblGrid>
+        <w:gridCol w:w="1987"/>
+        <w:gridCol w:w="1987"/>
+        <w:gridCol w:w="1987"/>
+        <w:gridCol w:w="1987"/>
+        <w:gridCol w:w="1987"/>
+      </w:tblGrid>
+      <w:tr>
+        <w:tc>
+          <w:tcPr>
+            <w:tcW w:type="dxa" w:w="1987"/>
+            <w:tcMar>
+              <w:top w:w="80" w:type="dxa"/>
+              <w:bottom w:w="80" w:type="dxa"/>
+              <w:left w:w="100" w:type="dxa"/>
+              <w:right w:w="100" w:type="dxa"/>
+            </w:tcMar>
+            <w:shd w:val="clear" w:color="auto" w:fill="0E2B50"/>
+          </w:tcPr>
+          <w:p>
+            <w:pPr>
+              <w:jc w:val="left"/>
+            </w:pPr>
+            <w:r>
+              <w:rPr>
+                <w:rFonts w:ascii="Calibri" w:hAnsi="Calibri"/>
+                <w:b/>
+                <w:color w:val="FFFFFF"/>
+                <w:sz w:val="19"/>
+              </w:rPr>
+              <w:t>#</w:t>
+            </w:r>
+          </w:p>
+        </w:tc>
+        <w:tc>
+          <w:tcPr>
+            <w:tcW w:type="dxa" w:w="1987"/>
+            <w:tcMar>
+              <w:top w:w="80" w:type="dxa"/>
+              <w:bottom w:w="80" w:type="dxa"/>
+              <w:left w:w="100" w:type="dxa"/>
+              <w:right w:w="100" w:type="dxa"/>
+            </w:tcMar>
+            <w:shd w:val="clear" w:color="auto" w:fill="0E2B50"/>
+          </w:tcPr>
+          <w:p>
+            <w:pPr>
+              <w:jc w:val="right"/>
+              <w:bidi w:val="1"/>
+            </w:pPr>
+            <w:r>
+              <w:rPr>
+                <w:rFonts w:ascii="Bahij Nazanin" w:hAnsi="Bahij Nazanin"/>
+                <w:b/>
+                <w:color w:val="FFFFFF"/>
+                <w:sz w:val="19"/>
+              </w:rPr>
+              <w:t>پوهاند / ژبپوهاند</w:t>
+            </w:r>
+          </w:p>
+        </w:tc>
+        <w:tc>
+          <w:tcPr>
+            <w:tcW w:type="dxa" w:w="1987"/>
+            <w:tcMar>
+              <w:top w:w="80" w:type="dxa"/>
+              <w:bottom w:w="80" w:type="dxa"/>
+              <w:left w:w="100" w:type="dxa"/>
+              <w:right w:w="100" w:type="dxa"/>
+            </w:tcMar>
+            <w:shd w:val="clear" w:color="auto" w:fill="0E2B50"/>
+          </w:tcPr>
+          <w:p>
+            <w:pPr>
+              <w:jc w:val="right"/>
+              <w:bidi w:val="1"/>
+            </w:pPr>
+            <w:r>
+              <w:rPr>
+                <w:rFonts w:ascii="Bahij Nazanin" w:hAnsi="Bahij Nazanin"/>
+                <w:b/>
+                <w:color w:val="FFFFFF"/>
+                <w:sz w:val="19"/>
+              </w:rPr>
+              <w:t>اثر او کال</w:t>
+            </w:r>
+          </w:p>
+        </w:tc>
+        <w:tc>
+          <w:tcPr>
+            <w:tcW w:type="dxa" w:w="1987"/>
+            <w:tcMar>
+              <w:top w:w="80" w:type="dxa"/>
+              <w:bottom w:w="80" w:type="dxa"/>
+              <w:left w:w="100" w:type="dxa"/>
+              <w:right w:w="100" w:type="dxa"/>
+            </w:tcMar>
+            <w:shd w:val="clear" w:color="auto" w:fill="0E2B50"/>
+          </w:tcPr>
+          <w:p>
+            <w:pPr>
+              <w:jc w:val="right"/>
+              <w:bidi w:val="1"/>
+            </w:pPr>
+            <w:r>
+              <w:rPr>
+                <w:rFonts w:ascii="Bahij Nazanin" w:hAnsi="Bahij Nazanin"/>
+                <w:b/>
+                <w:color w:val="FFFFFF"/>
+                <w:sz w:val="19"/>
+              </w:rPr>
+              <w:t>قول (Quotation)</w:t>
+            </w:r>
+          </w:p>
+        </w:tc>
+        <w:tc>
+          <w:tcPr>
+            <w:tcW w:type="dxa" w:w="1987"/>
+            <w:tcMar>
+              <w:top w:w="80" w:type="dxa"/>
+              <w:bottom w:w="80" w:type="dxa"/>
+              <w:left w:w="100" w:type="dxa"/>
+              <w:right w:w="100" w:type="dxa"/>
+            </w:tcMar>
+            <w:shd w:val="clear" w:color="auto" w:fill="0E2B50"/>
+          </w:tcPr>
+          <w:p>
+            <w:pPr>
+              <w:jc w:val="right"/>
+              <w:bidi w:val="1"/>
+            </w:pPr>
+            <w:r>
+              <w:rPr>
+                <w:rFonts w:ascii="Bahij Nazanin" w:hAnsi="Bahij Nazanin"/>
+                <w:b/>
+                <w:color w:val="FFFFFF"/>
+                <w:sz w:val="19"/>
+              </w:rPr>
+              <w:t>امتحاني افاده</w:t>
+            </w:r>
+          </w:p>
+        </w:tc>
+      </w:tr>
+      <w:tr>
+        <w:tc>
+          <w:tcPr>
+            <w:tcW w:type="dxa" w:w="1987"/>
+            <w:tcMar>
+              <w:top w:w="80" w:type="dxa"/>
+              <w:bottom w:w="80" w:type="dxa"/>
+              <w:left w:w="100" w:type="dxa"/>
+              <w:right w:w="100" w:type="dxa"/>
+            </w:tcMar>
+            <w:shd w:val="clear" w:color="auto" w:fill="F8FAFC"/>
+          </w:tcPr>
+          <w:p>
+            <w:pPr>
+              <w:jc w:val="left"/>
+            </w:pPr>
+            <w:r>
+              <w:rPr>
+                <w:rFonts w:ascii="Calibri" w:hAnsi="Calibri"/>
+                <w:color w:val="1E293B"/>
+                <w:sz w:val="19"/>
+              </w:rPr>
+              <w:t>1</w:t>
+            </w:r>
+          </w:p>
+        </w:tc>
+        <w:tc>
+          <w:tcPr>
+            <w:tcW w:type="dxa" w:w="1987"/>
+            <w:tcMar>
+              <w:top w:w="80" w:type="dxa"/>
+              <w:bottom w:w="80" w:type="dxa"/>
+              <w:left w:w="100" w:type="dxa"/>
+              <w:right w:w="100" w:type="dxa"/>
+            </w:tcMar>
+            <w:shd w:val="clear" w:color="auto" w:fill="F8FAFC"/>
+          </w:tcPr>
+          <w:p>
+            <w:pPr>
+              <w:jc w:val="right"/>
+              <w:bidi w:val="1"/>
+            </w:pPr>
+            <w:r>
+              <w:rPr>
+                <w:rFonts w:ascii="Bahij Nazanin" w:hAnsi="Bahij Nazanin"/>
+                <w:color w:val="1E293B"/>
+                <w:sz w:val="19"/>
+              </w:rPr>
+              <w:t>پوهاند مجاور احمد زیار</w:t>
+            </w:r>
+          </w:p>
+        </w:tc>
+        <w:tc>
+          <w:tcPr>
+            <w:tcW w:type="dxa" w:w="1987"/>
+            <w:tcMar>
+              <w:top w:w="80" w:type="dxa"/>
+              <w:bottom w:w="80" w:type="dxa"/>
+              <w:left w:w="100" w:type="dxa"/>
+              <w:right w:w="100" w:type="dxa"/>
+            </w:tcMar>
+            <w:shd w:val="clear" w:color="auto" w:fill="F8FAFC"/>
+          </w:tcPr>
+          <w:p>
+            <w:pPr>
+              <w:jc w:val="right"/>
+              <w:bidi w:val="1"/>
+            </w:pPr>
+            <w:r>
+              <w:rPr>
+                <w:rFonts w:ascii="Bahij Nazanin" w:hAnsi="Bahij Nazanin"/>
+                <w:color w:val="1E293B"/>
+                <w:sz w:val="19"/>
+              </w:rPr>
+              <w:t>*د پښتو ژبښود او ژباړن اصول (۱۹۸۳)*</w:t>
+            </w:r>
+          </w:p>
+        </w:tc>
+        <w:tc>
+          <w:tcPr>
+            <w:tcW w:type="dxa" w:w="1987"/>
+            <w:tcMar>
+              <w:top w:w="80" w:type="dxa"/>
+              <w:bottom w:w="80" w:type="dxa"/>
+              <w:left w:w="100" w:type="dxa"/>
+              <w:right w:w="100" w:type="dxa"/>
+            </w:tcMar>
+            <w:shd w:val="clear" w:color="auto" w:fill="F8FAFC"/>
+          </w:tcPr>
+          <w:p>
+            <w:pPr>
+              <w:jc w:val="right"/>
+              <w:bidi w:val="1"/>
+            </w:pPr>
+            <w:r>
+              <w:rPr>
+                <w:rFonts w:ascii="Bahij Nazanin" w:hAnsi="Bahij Nazanin"/>
+                <w:color w:val="1E293B"/>
+                <w:sz w:val="19"/>
+              </w:rPr>
+              <w:t>«ژباړه یوازې د وییو بدلون نه دی، بلکې د یوې ژبې له روحیې څخه بلې ژبې ته د تفکر او کلتوري نبض رالېږدول دي۔»</w:t>
+            </w:r>
+          </w:p>
+        </w:tc>
+        <w:tc>
+          <w:tcPr>
+            <w:tcW w:type="dxa" w:w="1987"/>
+            <w:tcMar>
+              <w:top w:w="80" w:type="dxa"/>
+              <w:bottom w:w="80" w:type="dxa"/>
+              <w:left w:w="100" w:type="dxa"/>
+              <w:right w:w="100" w:type="dxa"/>
+            </w:tcMar>
+            <w:shd w:val="clear" w:color="auto" w:fill="F8FAFC"/>
+          </w:tcPr>
+          <w:p>
+            <w:pPr>
+              <w:jc w:val="right"/>
+              <w:bidi w:val="1"/>
+            </w:pPr>
+            <w:r>
+              <w:rPr>
+                <w:rFonts w:ascii="Bahij Nazanin" w:hAnsi="Bahij Nazanin"/>
+                <w:color w:val="1E293B"/>
+                <w:sz w:val="19"/>
+              </w:rPr>
+              <w:t>د ژباړې د معنوي او فصیحوالي په ثبوت کې۔</w:t>
+            </w:r>
+          </w:p>
+        </w:tc>
+      </w:tr>
+      <w:tr>
+        <w:tc>
+          <w:tcPr>
+            <w:tcW w:type="dxa" w:w="1987"/>
+            <w:tcMar>
+              <w:top w:w="80" w:type="dxa"/>
+              <w:bottom w:w="80" w:type="dxa"/>
+              <w:left w:w="100" w:type="dxa"/>
+              <w:right w:w="100" w:type="dxa"/>
+            </w:tcMar>
+            <w:shd w:val="clear" w:color="auto" w:fill="FFFFFF"/>
+          </w:tcPr>
+          <w:p>
+            <w:pPr>
+              <w:jc w:val="left"/>
+            </w:pPr>
+            <w:r>
+              <w:rPr>
+                <w:rFonts w:ascii="Calibri" w:hAnsi="Calibri"/>
+                <w:color w:val="1E293B"/>
+                <w:sz w:val="19"/>
+              </w:rPr>
+              <w:t>2</w:t>
+            </w:r>
+          </w:p>
+        </w:tc>
+        <w:tc>
+          <w:tcPr>
+            <w:tcW w:type="dxa" w:w="1987"/>
+            <w:tcMar>
+              <w:top w:w="80" w:type="dxa"/>
+              <w:bottom w:w="80" w:type="dxa"/>
+              <w:left w:w="100" w:type="dxa"/>
+              <w:right w:w="100" w:type="dxa"/>
+            </w:tcMar>
+            <w:shd w:val="clear" w:color="auto" w:fill="FFFFFF"/>
+          </w:tcPr>
+          <w:p>
+            <w:pPr>
+              <w:jc w:val="right"/>
+              <w:bidi w:val="1"/>
+            </w:pPr>
+            <w:r>
+              <w:rPr>
+                <w:rFonts w:ascii="Bahij Nazanin" w:hAnsi="Bahij Nazanin"/>
+                <w:color w:val="1E293B"/>
+                <w:sz w:val="19"/>
+              </w:rPr>
+              <w:t>ډاکټر راج ولي شاه خټک</w:t>
+            </w:r>
+          </w:p>
+        </w:tc>
+        <w:tc>
+          <w:tcPr>
+            <w:tcW w:type="dxa" w:w="1987"/>
+            <w:tcMar>
+              <w:top w:w="80" w:type="dxa"/>
+              <w:bottom w:w="80" w:type="dxa"/>
+              <w:left w:w="100" w:type="dxa"/>
+              <w:right w:w="100" w:type="dxa"/>
+            </w:tcMar>
+            <w:shd w:val="clear" w:color="auto" w:fill="FFFFFF"/>
+          </w:tcPr>
+          <w:p>
+            <w:pPr>
+              <w:jc w:val="right"/>
+              <w:bidi w:val="1"/>
+            </w:pPr>
+            <w:r>
+              <w:rPr>
+                <w:rFonts w:ascii="Bahij Nazanin" w:hAnsi="Bahij Nazanin"/>
+                <w:color w:val="1E293B"/>
+                <w:sz w:val="19"/>
+              </w:rPr>
+              <w:t>*پښتو ژبه او ادب (۲۰۰۱)*</w:t>
+            </w:r>
+          </w:p>
+        </w:tc>
+        <w:tc>
+          <w:tcPr>
+            <w:tcW w:type="dxa" w:w="1987"/>
+            <w:tcMar>
+              <w:top w:w="80" w:type="dxa"/>
+              <w:bottom w:w="80" w:type="dxa"/>
+              <w:left w:w="100" w:type="dxa"/>
+              <w:right w:w="100" w:type="dxa"/>
+            </w:tcMar>
+            <w:shd w:val="clear" w:color="auto" w:fill="FFFFFF"/>
+          </w:tcPr>
+          <w:p>
+            <w:pPr>
+              <w:jc w:val="right"/>
+              <w:bidi w:val="1"/>
+            </w:pPr>
+            <w:r>
+              <w:rPr>
+                <w:rFonts w:ascii="Bahij Nazanin" w:hAnsi="Bahij Nazanin"/>
+                <w:color w:val="1E293B"/>
+                <w:sz w:val="19"/>
+              </w:rPr>
+              <w:t>«پښتو متلونه د پښتون اولس د زرګونو کلونو د ټولنیز، سیاسي او اخلاقي ژوند تجربه ده چې په لنډو ټکو کښې نغښتل شوې ده۔»</w:t>
+            </w:r>
+          </w:p>
+        </w:tc>
+        <w:tc>
+          <w:tcPr>
+            <w:tcW w:type="dxa" w:w="1987"/>
+            <w:tcMar>
+              <w:top w:w="80" w:type="dxa"/>
+              <w:bottom w:w="80" w:type="dxa"/>
+              <w:left w:w="100" w:type="dxa"/>
+              <w:right w:w="100" w:type="dxa"/>
+            </w:tcMar>
+            <w:shd w:val="clear" w:color="auto" w:fill="FFFFFF"/>
+          </w:tcPr>
+          <w:p>
+            <w:pPr>
+              <w:jc w:val="right"/>
+              <w:bidi w:val="1"/>
+            </w:pPr>
+            <w:r>
+              <w:rPr>
+                <w:rFonts w:ascii="Bahij Nazanin" w:hAnsi="Bahij Nazanin"/>
+                <w:color w:val="1E293B"/>
+                <w:sz w:val="19"/>
+              </w:rPr>
+              <w:t>د متلونو د کلتوري اهمیت په تشریح کې۔</w:t>
+            </w:r>
+          </w:p>
+        </w:tc>
+      </w:tr>
+      <w:tr>
+        <w:tc>
+          <w:tcPr>
+            <w:tcW w:type="dxa" w:w="1987"/>
+            <w:tcMar>
+              <w:top w:w="80" w:type="dxa"/>
+              <w:bottom w:w="80" w:type="dxa"/>
+              <w:left w:w="100" w:type="dxa"/>
+              <w:right w:w="100" w:type="dxa"/>
+            </w:tcMar>
+            <w:shd w:val="clear" w:color="auto" w:fill="F8FAFC"/>
+          </w:tcPr>
+          <w:p>
+            <w:pPr>
+              <w:jc w:val="left"/>
+            </w:pPr>
+            <w:r>
+              <w:rPr>
+                <w:rFonts w:ascii="Calibri" w:hAnsi="Calibri"/>
+                <w:color w:val="1E293B"/>
+                <w:sz w:val="19"/>
+              </w:rPr>
+              <w:t>3</w:t>
+            </w:r>
+          </w:p>
+        </w:tc>
+        <w:tc>
+          <w:tcPr>
+            <w:tcW w:type="dxa" w:w="1987"/>
+            <w:tcMar>
+              <w:top w:w="80" w:type="dxa"/>
+              <w:bottom w:w="80" w:type="dxa"/>
+              <w:left w:w="100" w:type="dxa"/>
+              <w:right w:w="100" w:type="dxa"/>
+            </w:tcMar>
+            <w:shd w:val="clear" w:color="auto" w:fill="F8FAFC"/>
+          </w:tcPr>
+          <w:p>
+            <w:pPr>
+              <w:jc w:val="right"/>
+              <w:bidi w:val="1"/>
+            </w:pPr>
+            <w:r>
+              <w:rPr>
+                <w:rFonts w:ascii="Bahij Nazanin" w:hAnsi="Bahij Nazanin"/>
+                <w:color w:val="1E293B"/>
+                <w:sz w:val="19"/>
+              </w:rPr>
+              <w:t>امیر حمزه خان شینواری</w:t>
+            </w:r>
+          </w:p>
+        </w:tc>
+        <w:tc>
+          <w:tcPr>
+            <w:tcW w:type="dxa" w:w="1987"/>
+            <w:tcMar>
+              <w:top w:w="80" w:type="dxa"/>
+              <w:bottom w:w="80" w:type="dxa"/>
+              <w:left w:w="100" w:type="dxa"/>
+              <w:right w:w="100" w:type="dxa"/>
+            </w:tcMar>
+            <w:shd w:val="clear" w:color="auto" w:fill="F8FAFC"/>
+          </w:tcPr>
+          <w:p>
+            <w:pPr>
+              <w:jc w:val="right"/>
+              <w:bidi w:val="1"/>
+            </w:pPr>
+            <w:r>
+              <w:rPr>
+                <w:rFonts w:ascii="Bahij Nazanin" w:hAnsi="Bahij Nazanin"/>
+                <w:color w:val="1E293B"/>
+                <w:sz w:val="19"/>
+              </w:rPr>
+              <w:t>*د ژوند وږمې (۱۹۶۸)*</w:t>
+            </w:r>
+          </w:p>
+        </w:tc>
+        <w:tc>
+          <w:tcPr>
+            <w:tcW w:type="dxa" w:w="1987"/>
+            <w:tcMar>
+              <w:top w:w="80" w:type="dxa"/>
+              <w:bottom w:w="80" w:type="dxa"/>
+              <w:left w:w="100" w:type="dxa"/>
+              <w:right w:w="100" w:type="dxa"/>
+            </w:tcMar>
+            <w:shd w:val="clear" w:color="auto" w:fill="F8FAFC"/>
+          </w:tcPr>
+          <w:p>
+            <w:pPr>
+              <w:jc w:val="right"/>
+              <w:bidi w:val="1"/>
+            </w:pPr>
+            <w:r>
+              <w:rPr>
+                <w:rFonts w:ascii="Bahij Nazanin" w:hAnsi="Bahij Nazanin"/>
+                <w:color w:val="1E293B"/>
+                <w:sz w:val="19"/>
+              </w:rPr>
+              <w:t>«مور د کائیناتو هغه راز دی چې الهي مینه او بښنه پکې په انساني شکل راڅرګنده شوې ده۔»</w:t>
+            </w:r>
+          </w:p>
+        </w:tc>
+        <w:tc>
+          <w:tcPr>
+            <w:tcW w:type="dxa" w:w="1987"/>
+            <w:tcMar>
+              <w:top w:w="80" w:type="dxa"/>
+              <w:bottom w:w="80" w:type="dxa"/>
+              <w:left w:w="100" w:type="dxa"/>
+              <w:right w:w="100" w:type="dxa"/>
+            </w:tcMar>
+            <w:shd w:val="clear" w:color="auto" w:fill="F8FAFC"/>
+          </w:tcPr>
+          <w:p>
+            <w:pPr>
+              <w:jc w:val="right"/>
+              <w:bidi w:val="1"/>
+            </w:pPr>
+            <w:r>
+              <w:rPr>
+                <w:rFonts w:ascii="Bahij Nazanin" w:hAnsi="Bahij Nazanin"/>
+                <w:color w:val="1E293B"/>
+                <w:sz w:val="19"/>
+              </w:rPr>
+              <w:t>د مور په اړه د پښتو متن په انګلیسي ژباړه کې د روحیې روښانه کول۔</w:t>
+            </w:r>
+          </w:p>
+        </w:tc>
+      </w:tr>
+      <w:tr>
+        <w:tc>
+          <w:tcPr>
+            <w:tcW w:type="dxa" w:w="1987"/>
+            <w:tcMar>
+              <w:top w:w="80" w:type="dxa"/>
+              <w:bottom w:w="80" w:type="dxa"/>
+              <w:left w:w="100" w:type="dxa"/>
+              <w:right w:w="100" w:type="dxa"/>
+            </w:tcMar>
+            <w:shd w:val="clear" w:color="auto" w:fill="FFFFFF"/>
+          </w:tcPr>
+          <w:p>
+            <w:pPr>
+              <w:jc w:val="left"/>
+            </w:pPr>
+            <w:r>
+              <w:rPr>
+                <w:rFonts w:ascii="Calibri" w:hAnsi="Calibri"/>
+                <w:color w:val="1E293B"/>
+                <w:sz w:val="19"/>
+              </w:rPr>
+              <w:t>4</w:t>
+            </w:r>
+          </w:p>
+        </w:tc>
+        <w:tc>
+          <w:tcPr>
+            <w:tcW w:type="dxa" w:w="1987"/>
+            <w:tcMar>
+              <w:top w:w="80" w:type="dxa"/>
+              <w:bottom w:w="80" w:type="dxa"/>
+              <w:left w:w="100" w:type="dxa"/>
+              <w:right w:w="100" w:type="dxa"/>
+            </w:tcMar>
+            <w:shd w:val="clear" w:color="auto" w:fill="FFFFFF"/>
+          </w:tcPr>
+          <w:p>
+            <w:pPr>
+              <w:jc w:val="left"/>
+            </w:pPr>
+            <w:r>
+              <w:rPr>
+                <w:rFonts w:ascii="Calibri" w:hAnsi="Calibri"/>
+                <w:color w:val="1E293B"/>
+                <w:sz w:val="19"/>
+              </w:rPr>
+              <w:t>Susan Bassnett</w:t>
+            </w:r>
+          </w:p>
+        </w:tc>
+        <w:tc>
+          <w:tcPr>
+            <w:tcW w:type="dxa" w:w="1987"/>
+            <w:tcMar>
+              <w:top w:w="80" w:type="dxa"/>
+              <w:bottom w:w="80" w:type="dxa"/>
+              <w:left w:w="100" w:type="dxa"/>
+              <w:right w:w="100" w:type="dxa"/>
+            </w:tcMar>
+            <w:shd w:val="clear" w:color="auto" w:fill="FFFFFF"/>
+          </w:tcPr>
+          <w:p>
+            <w:pPr>
+              <w:jc w:val="left"/>
+            </w:pPr>
+            <w:r>
+              <w:rPr>
+                <w:rFonts w:ascii="Calibri" w:hAnsi="Calibri"/>
+                <w:color w:val="1E293B"/>
+                <w:sz w:val="19"/>
+              </w:rPr>
+              <w:t>*Translation Studies (2002)*</w:t>
+            </w:r>
+          </w:p>
+        </w:tc>
+        <w:tc>
+          <w:tcPr>
+            <w:tcW w:type="dxa" w:w="1987"/>
+            <w:tcMar>
+              <w:top w:w="80" w:type="dxa"/>
+              <w:bottom w:w="80" w:type="dxa"/>
+              <w:left w:w="100" w:type="dxa"/>
+              <w:right w:w="100" w:type="dxa"/>
+            </w:tcMar>
+            <w:shd w:val="clear" w:color="auto" w:fill="FFFFFF"/>
+          </w:tcPr>
+          <w:p>
+            <w:pPr>
+              <w:jc w:val="left"/>
+            </w:pPr>
+            <w:r>
+              <w:rPr>
+                <w:rFonts w:ascii="Calibri" w:hAnsi="Calibri"/>
+                <w:color w:val="1E293B"/>
+                <w:sz w:val="19"/>
+              </w:rPr>
+              <w:t>*"Translation is not merely linguistic replacement; it is an act of cultural transposition where register and nuance dictate fidelity."*</w:t>
+            </w:r>
+          </w:p>
+        </w:tc>
+        <w:tc>
+          <w:tcPr>
+            <w:tcW w:type="dxa" w:w="1987"/>
+            <w:tcMar>
+              <w:top w:w="80" w:type="dxa"/>
+              <w:bottom w:w="80" w:type="dxa"/>
+              <w:left w:w="100" w:type="dxa"/>
+              <w:right w:w="100" w:type="dxa"/>
+            </w:tcMar>
+            <w:shd w:val="clear" w:color="auto" w:fill="FFFFFF"/>
+          </w:tcPr>
+          <w:p>
+            <w:pPr>
+              <w:jc w:val="right"/>
+              <w:bidi w:val="1"/>
+            </w:pPr>
+            <w:r>
+              <w:rPr>
+                <w:rFonts w:ascii="Bahij Nazanin" w:hAnsi="Bahij Nazanin"/>
+                <w:color w:val="1E293B"/>
+                <w:sz w:val="19"/>
+              </w:rPr>
+              <w:t>د ژباړې په فني اصولو کې د نمرې لوړولو لپاره۔</w:t>
+            </w:r>
+          </w:p>
+        </w:tc>
+      </w:tr>
+      <w:tr>
+        <w:tc>
+          <w:tcPr>
+            <w:tcW w:type="dxa" w:w="1987"/>
+            <w:tcMar>
+              <w:top w:w="80" w:type="dxa"/>
+              <w:bottom w:w="80" w:type="dxa"/>
+              <w:left w:w="100" w:type="dxa"/>
+              <w:right w:w="100" w:type="dxa"/>
+            </w:tcMar>
+            <w:shd w:val="clear" w:color="auto" w:fill="F8FAFC"/>
+          </w:tcPr>
+          <w:p>
+            <w:pPr>
+              <w:jc w:val="left"/>
+            </w:pPr>
+            <w:r>
+              <w:rPr>
+                <w:rFonts w:ascii="Calibri" w:hAnsi="Calibri"/>
+                <w:color w:val="1E293B"/>
+                <w:sz w:val="19"/>
+              </w:rPr>
+              <w:t>5</w:t>
+            </w:r>
+          </w:p>
+        </w:tc>
+        <w:tc>
+          <w:tcPr>
+            <w:tcW w:type="dxa" w:w="1987"/>
+            <w:tcMar>
+              <w:top w:w="80" w:type="dxa"/>
+              <w:bottom w:w="80" w:type="dxa"/>
+              <w:left w:w="100" w:type="dxa"/>
+              <w:right w:w="100" w:type="dxa"/>
+            </w:tcMar>
+            <w:shd w:val="clear" w:color="auto" w:fill="F8FAFC"/>
+          </w:tcPr>
+          <w:p>
+            <w:pPr>
+              <w:jc w:val="right"/>
+              <w:bidi w:val="1"/>
+            </w:pPr>
+            <w:r>
+              <w:rPr>
+                <w:rFonts w:ascii="Bahij Nazanin" w:hAnsi="Bahij Nazanin"/>
+                <w:color w:val="1E293B"/>
+                <w:sz w:val="19"/>
+              </w:rPr>
+              <w:t>قلندر مومند</w:t>
+            </w:r>
+          </w:p>
+        </w:tc>
+        <w:tc>
+          <w:tcPr>
+            <w:tcW w:type="dxa" w:w="1987"/>
+            <w:tcMar>
+              <w:top w:w="80" w:type="dxa"/>
+              <w:bottom w:w="80" w:type="dxa"/>
+              <w:left w:w="100" w:type="dxa"/>
+              <w:right w:w="100" w:type="dxa"/>
+            </w:tcMar>
+            <w:shd w:val="clear" w:color="auto" w:fill="F8FAFC"/>
+          </w:tcPr>
+          <w:p>
+            <w:pPr>
+              <w:jc w:val="right"/>
+              <w:bidi w:val="1"/>
+            </w:pPr>
+            <w:r>
+              <w:rPr>
+                <w:rFonts w:ascii="Bahij Nazanin" w:hAnsi="Bahij Nazanin"/>
+                <w:color w:val="1E293B"/>
+                <w:sz w:val="19"/>
+              </w:rPr>
+              <w:t>*سباوون (۱۹۸۴)*</w:t>
+            </w:r>
+          </w:p>
+        </w:tc>
+        <w:tc>
+          <w:tcPr>
+            <w:tcW w:type="dxa" w:w="1987"/>
+            <w:tcMar>
+              <w:top w:w="80" w:type="dxa"/>
+              <w:bottom w:w="80" w:type="dxa"/>
+              <w:left w:w="100" w:type="dxa"/>
+              <w:right w:w="100" w:type="dxa"/>
+            </w:tcMar>
+            <w:shd w:val="clear" w:color="auto" w:fill="F8FAFC"/>
+          </w:tcPr>
+          <w:p>
+            <w:pPr>
+              <w:jc w:val="right"/>
+              <w:bidi w:val="1"/>
+            </w:pPr>
+            <w:r>
+              <w:rPr>
+                <w:rFonts w:ascii="Bahij Nazanin" w:hAnsi="Bahij Nazanin"/>
+                <w:color w:val="1E293B"/>
+                <w:sz w:val="19"/>
+              </w:rPr>
+              <w:t>«په ژباړه کښې که د خپلې ژبې فصاحت، د تورو خواږه او د اصطلاحاتو شتمني ونه ساتل شي، نو ژباړل شوی متن بې روحه جسد وي۔»</w:t>
+            </w:r>
+          </w:p>
+        </w:tc>
+        <w:tc>
+          <w:tcPr>
+            <w:tcW w:type="dxa" w:w="1987"/>
+            <w:tcMar>
+              <w:top w:w="80" w:type="dxa"/>
+              <w:bottom w:w="80" w:type="dxa"/>
+              <w:left w:w="100" w:type="dxa"/>
+              <w:right w:w="100" w:type="dxa"/>
+            </w:tcMar>
+            <w:shd w:val="clear" w:color="auto" w:fill="F8FAFC"/>
+          </w:tcPr>
+          <w:p>
+            <w:pPr>
+              <w:jc w:val="right"/>
+              <w:bidi w:val="1"/>
+            </w:pPr>
+            <w:r>
+              <w:rPr>
+                <w:rFonts w:ascii="Bahij Nazanin" w:hAnsi="Bahij Nazanin"/>
+                <w:color w:val="1E293B"/>
+                <w:sz w:val="19"/>
+              </w:rPr>
+              <w:t>د ژباړې د ادبي معیار او ژبني خوند په ملاتړ کې۔</w:t>
+            </w:r>
+          </w:p>
+        </w:tc>
+      </w:tr>
+    </w:tbl>
+    <w:p>
+      <w:pPr>
+        <w:spacing w:after="80"/>
+      </w:pPr>
     </w:p>
     <w:p>
       <w:pPr>

</xml_diff>